<commit_message>
feat(contract): integrate FE-BE Protocol 1 contract (TCP 7079 JSONL) and sync complete project reports
</commit_message>
<xml_diff>
--- a/docs/BaoCao_DeTai_DHOPM_2312741_NguyenThanhTam.docx
+++ b/docs/BaoCao_DeTai_DHOPM_2312741_NguyenThanhTam.docx
@@ -179,7 +179,7 @@
           <w:color w:val="1E293B"/>
           <w:sz w:val="26"/>
         </w:rPr>
-        <w:t>Thành viên phối hợp:    Nguyễn Hữu Trung Sơn (Phụ trách Core Engine)</w:t>
+        <w:t>Thành viên phối hợp:    Nguyễn Hữu Trung Sơn (Phụ trách Core Engine &amp; FE Contract)</w:t>
       </w:r>
     </w:p>
     <w:p>
@@ -221,7 +221,7 @@
     </w:p>
     <w:p>
       <w:pPr>
-        <w:spacing w:before="300" w:after="240" w:line="312" w:lineRule="auto"/>
+        <w:spacing w:before="0" w:after="240" w:line="312" w:lineRule="auto"/>
         <w:jc w:val="both"/>
       </w:pPr>
       <w:r>
@@ -1051,7 +1051,7 @@
           <w:color w:val="1E293B"/>
           <w:sz w:val="26"/>
         </w:rPr>
-        <w:t>- Nghiên cứu lý thuyết học thuật: Làm chủ bài toán Khai phá mẫu độ chiếm dụng cao (HOPM) trên luồng dữ liệu thời gian thực theo bài báo khoa học quốc tế EAAI 2026. Nắm vững mô hình suy giảm Damped Window (0 &lt; f &lt;= 1), cận trên DUBO cắt tỉa an toàn và cấu trúc nén Global DHO-List một lần quét.</w:t>
+        <w:t>- Nghiên cứu lý thuyết học thuật: Làm chủ bài toán Khai phá mẫu độ chiếm dụng cao (HOPM) trên luồng dữ liệu theo bài báo khoa học quốc tế EAAI 2026. Nắm vững mô hình Damped Window, cận trên DUBO cắt tỉa an toàn, cấu trúc nén Global DHO-List một lần quét.</w:t>
       </w:r>
     </w:p>
     <w:p>
@@ -1067,7 +1067,7 @@
           <w:color w:val="1E293B"/>
           <w:sz w:val="26"/>
         </w:rPr>
-        <w:t>- Xây dựng ứng dụng phần mềm trực quan hóa: Phát triển hoàn chỉnh phần mềm DHOPM Stream Visualizer bằng Java 21 và JavaFX, gồm 6 Tab chức năng trực quan hóa cấu trúc cây DHO-Tree, bảng kết quả với Support (tx / %), bộ khảo sát đa ngưỡng Benchmark Sweep dựng biểu đồ bài báo (Fig 6, 11, 13), tích hợp Tson/SPMF Engine với tiến trình ngầm, nút dừng an toàn và ước tính ETA, quản lý lịch sử khai phá (Memento) và nhật ký tính toán chi tiết (Calculation Logger).</w:t>
+        <w:t>- Xây dựng ứng dụng phần mềm trực quan hóa: Phát triển hoàn chỉnh phần mềm DHOPM Stream Visualizer bằng Java 21 và JavaFX, gồm 6 Tab chức năng trực quan hóa cấu trúc cây DHO-Tree, bảng kết quả với Support (tx / %), bộ khảo sát đa ngưỡng Benchmark Sweep dựng biểu đồ bài báo (Fig 6, 11, 13), tích hợp Tson/SPMF Engine với tiến trình ngầm, nút dừng an toàn và ước tính ETA, quản lý lịch sử (Memento) và nhật ký tính toán (Calculation Logger).</w:t>
       </w:r>
     </w:p>
     <w:p>
@@ -1083,7 +1083,23 @@
           <w:color w:val="1E293B"/>
           <w:sz w:val="26"/>
         </w:rPr>
-        <w:t>- Áp dụng kiến trúc chuẩn công nghiệp: Triển khai thành công 9 Mẫu thiết kế phần mềm GoF, phân tầng MVC sạch, đảm bảo 100% ca kiểm thử tự động (Unit Test) vượt qua kiểm thử.</w:t>
+        <w:t>- Áp dụng Hợp đồng giao thức chuẩn Frontend ↔ Backend (FE Contract Protocol 1): Kết nối độc lập qua TCP Socket 7079 với định dạng JSON Lines, tự động bắt tay handshake 'hello', hỗ trợ bộ lệnh 'mine', 'window', 'inspect', 'golden', 'fetch', và tự động mirror file kết quả cục bộ (R14 / D48).</w:t>
+      </w:r>
+    </w:p>
+    <w:p>
+      <w:pPr>
+        <w:spacing w:before="0" w:after="120" w:line="312" w:lineRule="auto"/>
+        <w:jc w:val="both"/>
+      </w:pPr>
+      <w:r>
+        <w:rPr>
+          <w:rFonts w:ascii="Times New Roman" w:hAnsi="Times New Roman"/>
+          <w:b w:val="0"/>
+          <w:i w:val="0"/>
+          <w:color w:val="1E293B"/>
+          <w:sz w:val="26"/>
+        </w:rPr>
+        <w:t>- Áp dụng kiến trúc chuẩn công nghiệp: Triển khai 9 Mẫu thiết kế phần mềm GoF, phân tầng Clean MVC, kiểm thử tự động đạt 100% (51/51 test cases PASS).</w:t>
       </w:r>
     </w:p>
     <w:p>
@@ -1147,7 +1163,7 @@
           <w:color w:val="1E293B"/>
           <w:sz w:val="26"/>
         </w:rPr>
-        <w:t>Chương 3: Phân tích và thiết kế hệ thống</w:t>
+        <w:t>Chương 3: Phân tích và thiết kế hệ thống (kèm Đặc tả Hợp đồng FE ↔ BE)</w:t>
       </w:r>
     </w:p>
     <w:p>
@@ -1227,7 +1243,7 @@
           <w:color w:val="1E293B"/>
           <w:sz w:val="26"/>
         </w:rPr>
-        <w:t>- Công nghệ sử dụng: Java 21 LTS (OpenJDK), JavaFX 21, Apache Maven 3.9, Thư viện SPMF Data Mining, JUnit 5.</w:t>
+        <w:t>- Công nghệ: Java 21 LTS, JavaFX 21, Apache Maven 3.9, SPMF Data Mining, JUnit 5, TCP Sockets &amp; JSON Lines.</w:t>
       </w:r>
     </w:p>
     <w:p>
@@ -1243,7 +1259,7 @@
           <w:color w:val="1E293B"/>
           <w:sz w:val="26"/>
         </w:rPr>
-        <w:t>- Công cụ phát triển: IntelliJ IDEA, Git, GitHub (kho mã nguồn https://github.com/2312741-sudo/javanc.git), macOS / Linux.</w:t>
+        <w:t>- Công cụ: IntelliJ IDEA, Git, GitHub (kho mã nguồn https://github.com/2312741-sudo/javanc.git), macOS / Linux.</w:t>
       </w:r>
     </w:p>
     <w:p>
@@ -1291,7 +1307,7 @@
           <w:color w:val="1E293B"/>
           <w:sz w:val="26"/>
         </w:rPr>
-        <w:t>- Đạt 100% ca kiểm thử tự động (48/48 test cases PASS), khớp tuyệt đối với số liệu công trình khoa học gốc EAAI 2026.</w:t>
+        <w:t>- Kết nối linh hoạt cả In-process Engine và Remote TCP Backend qua Socket 7079 theo đúng CONTRACT.md.</w:t>
       </w:r>
     </w:p>
     <w:p>
@@ -1307,7 +1323,7 @@
           <w:color w:val="1E293B"/>
           <w:sz w:val="26"/>
         </w:rPr>
-        <w:t>- Nâng cao kỹ năng phân tích thiết kế, làm việc nhóm, áp dụng mẫu thiết kế hướng đối tượng và viết tài liệu học thuật.</w:t>
+        <w:t>- Vượt qua 100% bộ 51 ca kiểm thử tự động (Unit &amp; Integration Tests), khớp tuyệt đối với số liệu bài báo gốc.</w:t>
       </w:r>
     </w:p>
     <w:p>
@@ -1355,7 +1371,7 @@
           <w:color w:val="1E293B"/>
           <w:sz w:val="26"/>
         </w:rPr>
-        <w:t>[2] E. Gamma, R. Helm, R. Johnson, and J. Vlissides, 'Design Patterns: Elements of Reusable Object-Oriented Software', Addison-Wesley, 1994.</w:t>
+        <w:t>[2] Hợp đồng kết nối FE ↔ BE (CONTRACT.md), Tson-dev/JVNC, 2026.</w:t>
       </w:r>
     </w:p>
     <w:p>
@@ -1437,7 +1453,7 @@
                 <w:b/>
                 <w:sz w:val="24"/>
               </w:rPr>
-              <w:t>Đà Lạt, ngày 08 tháng 10 năm 2026</w:t>
+              <w:t>Đà Lạt, ngày 11 tháng 10 năm 2026</w:t>
               <w:br/>
               <w:t>Sinh viên thực hiện</w:t>
               <w:br/>
@@ -2407,7 +2423,7 @@
           <w:rFonts w:ascii="Times New Roman" w:hAnsi="Times New Roman"/>
           <w:sz w:val="24"/>
         </w:rPr>
-        <w:t xml:space="preserve">        3.2.3. Các bảng đặc tả Use Case chi tiết</w:t>
+        <w:t xml:space="preserve">        3.2.3. Các bảng đặc tả Use Case chi tiết (Bảng 3 - 21)</w:t>
       </w:r>
       <w:r>
         <w:rPr>
@@ -2451,6 +2467,29 @@
       <w:r>
         <w:rPr>
           <w:rFonts w:ascii="Times New Roman" w:hAnsi="Times New Roman"/>
+          <w:sz w:val="24"/>
+        </w:rPr>
+        <w:t xml:space="preserve">        3.2.5. Hợp đồng giao thức kết nối Frontend ↔ Backend (Protocol 1)</w:t>
+      </w:r>
+      <w:r>
+        <w:rPr>
+          <w:rFonts w:ascii="Times New Roman" w:hAnsi="Times New Roman"/>
+          <w:sz w:val="24"/>
+        </w:rPr>
+        <w:tab/>
+        <w:t>52</w:t>
+      </w:r>
+    </w:p>
+    <w:p>
+      <w:pPr>
+        <w:tabs>
+          <w:tab w:pos="9071" w:val="left"/>
+        </w:tabs>
+        <w:spacing w:line="288" w:lineRule="auto" w:after="60"/>
+      </w:pPr>
+      <w:r>
+        <w:rPr>
+          <w:rFonts w:ascii="Times New Roman" w:hAnsi="Times New Roman"/>
           <w:b/>
           <w:sz w:val="24"/>
         </w:rPr>
@@ -2463,7 +2502,7 @@
           <w:sz w:val="24"/>
         </w:rPr>
         <w:tab/>
-        <w:t>52</w:t>
+        <w:t>55</w:t>
       </w:r>
     </w:p>
     <w:p>
@@ -2486,7 +2525,7 @@
           <w:sz w:val="24"/>
         </w:rPr>
         <w:tab/>
-        <w:t>52</w:t>
+        <w:t>55</w:t>
       </w:r>
     </w:p>
     <w:p>
@@ -2509,7 +2548,99 @@
           <w:sz w:val="24"/>
         </w:rPr>
         <w:tab/>
-        <w:t>54</w:t>
+        <w:t>57</w:t>
+      </w:r>
+    </w:p>
+    <w:p>
+      <w:pPr>
+        <w:tabs>
+          <w:tab w:pos="9071" w:val="left"/>
+        </w:tabs>
+        <w:spacing w:line="288" w:lineRule="auto" w:after="60"/>
+      </w:pPr>
+      <w:r>
+        <w:rPr>
+          <w:rFonts w:ascii="Times New Roman" w:hAnsi="Times New Roman"/>
+          <w:sz w:val="24"/>
+        </w:rPr>
+        <w:t xml:space="preserve">        4.2.1. Thuật toán lõi DHOPMEngine (Template Method)</w:t>
+      </w:r>
+      <w:r>
+        <w:rPr>
+          <w:rFonts w:ascii="Times New Roman" w:hAnsi="Times New Roman"/>
+          <w:sz w:val="24"/>
+        </w:rPr>
+        <w:tab/>
+        <w:t>57</w:t>
+      </w:r>
+    </w:p>
+    <w:p>
+      <w:pPr>
+        <w:tabs>
+          <w:tab w:pos="9071" w:val="left"/>
+        </w:tabs>
+        <w:spacing w:line="288" w:lineRule="auto" w:after="60"/>
+      </w:pPr>
+      <w:r>
+        <w:rPr>
+          <w:rFonts w:ascii="Times New Roman" w:hAnsi="Times New Roman"/>
+          <w:sz w:val="24"/>
+        </w:rPr>
+        <w:t xml:space="preserve">        4.2.2. Dịch vụ Benchmark Sweep đa ngưỡng minSup</w:t>
+      </w:r>
+      <w:r>
+        <w:rPr>
+          <w:rFonts w:ascii="Times New Roman" w:hAnsi="Times New Roman"/>
+          <w:sz w:val="24"/>
+        </w:rPr>
+        <w:tab/>
+        <w:t>58</w:t>
+      </w:r>
+    </w:p>
+    <w:p>
+      <w:pPr>
+        <w:tabs>
+          <w:tab w:pos="9071" w:val="left"/>
+        </w:tabs>
+        <w:spacing w:line="288" w:lineRule="auto" w:after="60"/>
+      </w:pPr>
+      <w:r>
+        <w:rPr>
+          <w:rFonts w:ascii="Times New Roman" w:hAnsi="Times New Roman"/>
+          <w:sz w:val="24"/>
+        </w:rPr>
+        <w:t xml:space="preserve">        4.2.3. Quản lý lịch sử bằng Memento Pattern</w:t>
+      </w:r>
+      <w:r>
+        <w:rPr>
+          <w:rFonts w:ascii="Times New Roman" w:hAnsi="Times New Roman"/>
+          <w:sz w:val="24"/>
+        </w:rPr>
+        <w:tab/>
+        <w:t>59</w:t>
+      </w:r>
+    </w:p>
+    <w:p>
+      <w:pPr>
+        <w:tabs>
+          <w:tab w:pos="9071" w:val="left"/>
+        </w:tabs>
+        <w:spacing w:line="288" w:lineRule="auto" w:after="60"/>
+      </w:pPr>
+      <w:r>
+        <w:rPr>
+          <w:rFonts w:ascii="Times New Roman" w:hAnsi="Times New Roman"/>
+          <w:sz w:val="24"/>
+        </w:rPr>
+        <w:t xml:space="preserve">        4.2.4. Phân hệ kết nối TCP Socket (DhopmContractTcpClient)</w:t>
+      </w:r>
+      <w:r>
+        <w:rPr>
+          <w:rFonts w:ascii="Times New Roman" w:hAnsi="Times New Roman"/>
+          <w:sz w:val="24"/>
+        </w:rPr>
+        <w:tab/>
+        <w:t>60</w:t>
       </w:r>
     </w:p>
     <w:p>
@@ -2532,7 +2663,7 @@
           <w:sz w:val="24"/>
         </w:rPr>
         <w:tab/>
-        <w:t>57</w:t>
+        <w:t>61</w:t>
       </w:r>
     </w:p>
     <w:p>
@@ -2555,7 +2686,7 @@
           <w:sz w:val="24"/>
         </w:rPr>
         <w:tab/>
-        <w:t>57</w:t>
+        <w:t>61</w:t>
       </w:r>
     </w:p>
     <w:p>
@@ -2578,7 +2709,7 @@
           <w:sz w:val="24"/>
         </w:rPr>
         <w:tab/>
-        <w:t>59</w:t>
+        <w:t>63</w:t>
       </w:r>
     </w:p>
     <w:p>
@@ -2601,7 +2732,7 @@
           <w:sz w:val="24"/>
         </w:rPr>
         <w:tab/>
-        <w:t>61</w:t>
+        <w:t>65</w:t>
       </w:r>
     </w:p>
     <w:p>
@@ -2624,7 +2755,7 @@
           <w:sz w:val="24"/>
         </w:rPr>
         <w:tab/>
-        <w:t>63</w:t>
+        <w:t>67</w:t>
       </w:r>
     </w:p>
     <w:p>
@@ -2647,7 +2778,7 @@
           <w:sz w:val="24"/>
         </w:rPr>
         <w:tab/>
-        <w:t>65</w:t>
+        <w:t>69</w:t>
       </w:r>
     </w:p>
     <w:p>
@@ -2670,7 +2801,7 @@
           <w:sz w:val="24"/>
         </w:rPr>
         <w:tab/>
-        <w:t>67</w:t>
+        <w:t>71</w:t>
       </w:r>
     </w:p>
     <w:p>
@@ -2695,7 +2826,7 @@
           <w:sz w:val="24"/>
         </w:rPr>
         <w:tab/>
-        <w:t>69</w:t>
+        <w:t>73</w:t>
       </w:r>
     </w:p>
     <w:p>
@@ -2718,7 +2849,7 @@
           <w:sz w:val="24"/>
         </w:rPr>
         <w:tab/>
-        <w:t>69</w:t>
+        <w:t>73</w:t>
       </w:r>
     </w:p>
     <w:p>
@@ -2733,7 +2864,7 @@
           <w:rFonts w:ascii="Times New Roman" w:hAnsi="Times New Roman"/>
           <w:sz w:val="24"/>
         </w:rPr>
-        <w:t xml:space="preserve">    5.2. Kết quả kiểm thử tự động toàn diện (48 Test Cases)</w:t>
+        <w:t xml:space="preserve">    5.2. Kết quả kiểm thử tự động toàn diện (51 Test Cases)</w:t>
       </w:r>
       <w:r>
         <w:rPr>
@@ -2741,7 +2872,7 @@
           <w:sz w:val="24"/>
         </w:rPr>
         <w:tab/>
-        <w:t>70</w:t>
+        <w:t>74</w:t>
       </w:r>
     </w:p>
     <w:p>
@@ -2764,7 +2895,7 @@
           <w:sz w:val="24"/>
         </w:rPr>
         <w:tab/>
-        <w:t>71</w:t>
+        <w:t>75</w:t>
       </w:r>
     </w:p>
     <w:p>
@@ -2787,7 +2918,7 @@
           <w:sz w:val="24"/>
         </w:rPr>
         <w:tab/>
-        <w:t>73</w:t>
+        <w:t>77</w:t>
       </w:r>
     </w:p>
     <w:p>
@@ -2812,7 +2943,7 @@
           <w:sz w:val="24"/>
         </w:rPr>
         <w:tab/>
-        <w:t>75</w:t>
+        <w:t>79</w:t>
       </w:r>
     </w:p>
     <w:p>
@@ -2835,7 +2966,7 @@
           <w:sz w:val="24"/>
         </w:rPr>
         <w:tab/>
-        <w:t>75</w:t>
+        <w:t>79</w:t>
       </w:r>
     </w:p>
     <w:p>
@@ -2858,7 +2989,7 @@
           <w:sz w:val="24"/>
         </w:rPr>
         <w:tab/>
-        <w:t>76</w:t>
+        <w:t>80</w:t>
       </w:r>
     </w:p>
     <w:p>
@@ -2883,7 +3014,7 @@
           <w:sz w:val="24"/>
         </w:rPr>
         <w:tab/>
-        <w:t>77</w:t>
+        <w:t>81</w:t>
       </w:r>
     </w:p>
     <w:p>
@@ -2908,7 +3039,7 @@
           <w:sz w:val="24"/>
         </w:rPr>
         <w:tab/>
-        <w:t>79</w:t>
+        <w:t>83</w:t>
       </w:r>
     </w:p>
     <w:p>
@@ -3205,7 +3336,7 @@
           <w:sz w:val="24"/>
         </w:rPr>
         <w:tab/>
-        <w:t>53</w:t>
+        <w:t>56</w:t>
       </w:r>
     </w:p>
     <w:p>
@@ -3228,7 +3359,7 @@
           <w:sz w:val="24"/>
         </w:rPr>
         <w:tab/>
-        <w:t>58</w:t>
+        <w:t>62</w:t>
       </w:r>
     </w:p>
     <w:p>
@@ -3251,7 +3382,7 @@
           <w:sz w:val="24"/>
         </w:rPr>
         <w:tab/>
-        <w:t>60</w:t>
+        <w:t>64</w:t>
       </w:r>
     </w:p>
     <w:p>
@@ -3274,7 +3405,7 @@
           <w:sz w:val="24"/>
         </w:rPr>
         <w:tab/>
-        <w:t>62</w:t>
+        <w:t>66</w:t>
       </w:r>
     </w:p>
     <w:p>
@@ -3297,7 +3428,7 @@
           <w:sz w:val="24"/>
         </w:rPr>
         <w:tab/>
-        <w:t>64</w:t>
+        <w:t>68</w:t>
       </w:r>
     </w:p>
     <w:p>
@@ -3320,7 +3451,7 @@
           <w:sz w:val="24"/>
         </w:rPr>
         <w:tab/>
-        <w:t>66</w:t>
+        <w:t>70</w:t>
       </w:r>
     </w:p>
     <w:p>
@@ -3343,7 +3474,7 @@
           <w:sz w:val="24"/>
         </w:rPr>
         <w:tab/>
-        <w:t>68</w:t>
+        <w:t>72</w:t>
       </w:r>
     </w:p>
     <w:p>
@@ -3358,7 +3489,7 @@
           <w:rFonts w:ascii="Times New Roman" w:hAnsi="Times New Roman"/>
           <w:sz w:val="24"/>
         </w:rPr>
-        <w:t>Hình 19. Kết quả thực thi kiểm thử tự động 48/48 test cases thành công trên Maven Surefire</w:t>
+        <w:t>Hình 19. Kết quả thực thi kiểm thử tự động 51/51 test cases thành công trên Maven Surefire</w:t>
       </w:r>
       <w:r>
         <w:rPr>
@@ -3366,7 +3497,7 @@
           <w:sz w:val="24"/>
         </w:rPr>
         <w:tab/>
-        <w:t>70</w:t>
+        <w:t>74</w:t>
       </w:r>
     </w:p>
     <w:p>
@@ -3862,7 +3993,7 @@
           <w:rFonts w:ascii="Times New Roman" w:hAnsi="Times New Roman"/>
           <w:sz w:val="24"/>
         </w:rPr>
-        <w:t>Bảng 21. Cấu trúc dữ liệu thực thể PatternResult</w:t>
+        <w:t>Bảng 21. Bảng đặc tả Use case Kết nối Backend qua TCP Socket 7079 theo Contract Protocol 1</w:t>
       </w:r>
       <w:r>
         <w:rPr>
@@ -3885,7 +4016,7 @@
           <w:rFonts w:ascii="Times New Roman" w:hAnsi="Times New Roman"/>
           <w:sz w:val="24"/>
         </w:rPr>
-        <w:t>Bảng 22. Cấu trúc dữ liệu thực thể DHOEntry</w:t>
+        <w:t>Bảng 22. Cấu trúc dữ liệu thực thể PatternResult</w:t>
       </w:r>
       <w:r>
         <w:rPr>
@@ -3908,30 +4039,7 @@
           <w:rFonts w:ascii="Times New Roman" w:hAnsi="Times New Roman"/>
           <w:sz w:val="24"/>
         </w:rPr>
-        <w:t>Bảng 23. Cấu trúc dữ liệu thực thể MiningRunMemento</w:t>
-      </w:r>
-      <w:r>
-        <w:rPr>
-          <w:rFonts w:ascii="Times New Roman" w:hAnsi="Times New Roman"/>
-          <w:sz w:val="24"/>
-        </w:rPr>
-        <w:tab/>
-        <w:t>49</w:t>
-      </w:r>
-    </w:p>
-    <w:p>
-      <w:pPr>
-        <w:tabs>
-          <w:tab w:pos="9071" w:val="left"/>
-        </w:tabs>
-        <w:spacing w:line="288" w:lineRule="auto" w:after="60"/>
-      </w:pPr>
-      <w:r>
-        <w:rPr>
-          <w:rFonts w:ascii="Times New Roman" w:hAnsi="Times New Roman"/>
-          <w:sz w:val="24"/>
-        </w:rPr>
-        <w:t>Bảng 24. Cấu trúc dữ liệu thực thể MinSupSweepResult</w:t>
+        <w:t>Bảng 23. Cấu trúc dữ liệu thực thể DHOEntry</w:t>
       </w:r>
       <w:r>
         <w:rPr>
@@ -3954,7 +4062,30 @@
           <w:rFonts w:ascii="Times New Roman" w:hAnsi="Times New Roman"/>
           <w:sz w:val="24"/>
         </w:rPr>
-        <w:t>Bảng 25. Cấu trúc dữ liệu thực thể CalculationLogEntry</w:t>
+        <w:t>Bảng 24. Cấu trúc dữ liệu thực thể MiningRunMemento</w:t>
+      </w:r>
+      <w:r>
+        <w:rPr>
+          <w:rFonts w:ascii="Times New Roman" w:hAnsi="Times New Roman"/>
+          <w:sz w:val="24"/>
+        </w:rPr>
+        <w:tab/>
+        <w:t>50</w:t>
+      </w:r>
+    </w:p>
+    <w:p>
+      <w:pPr>
+        <w:tabs>
+          <w:tab w:pos="9071" w:val="left"/>
+        </w:tabs>
+        <w:spacing w:line="288" w:lineRule="auto" w:after="60"/>
+      </w:pPr>
+      <w:r>
+        <w:rPr>
+          <w:rFonts w:ascii="Times New Roman" w:hAnsi="Times New Roman"/>
+          <w:sz w:val="24"/>
+        </w:rPr>
+        <w:t>Bảng 25. Cấu trúc dữ liệu thực thể MinSupSweepResult</w:t>
       </w:r>
       <w:r>
         <w:rPr>
@@ -3977,7 +4108,7 @@
           <w:rFonts w:ascii="Times New Roman" w:hAnsi="Times New Roman"/>
           <w:sz w:val="24"/>
         </w:rPr>
-        <w:t>Bảng 26. Cấu trúc dữ liệu thực thể Transaction</w:t>
+        <w:t>Bảng 26. Cấu trúc dữ liệu thực thể CalculationLogEntry</w:t>
       </w:r>
       <w:r>
         <w:rPr>
@@ -3985,7 +4116,7 @@
           <w:sz w:val="24"/>
         </w:rPr>
         <w:tab/>
-        <w:t>51</w:t>
+        <w:t>52</w:t>
       </w:r>
     </w:p>
     <w:p>
@@ -4000,7 +4131,7 @@
           <w:rFonts w:ascii="Times New Roman" w:hAnsi="Times New Roman"/>
           <w:sz w:val="24"/>
         </w:rPr>
-        <w:t>Bảng 27. Tổng hợp các bộ dữ liệu thực nghiệm chuẩn bài báo</w:t>
+        <w:t>Bảng 27. Cấu trúc dữ liệu thực thể Transaction</w:t>
       </w:r>
       <w:r>
         <w:rPr>
@@ -4008,7 +4139,7 @@
           <w:sz w:val="24"/>
         </w:rPr>
         <w:tab/>
-        <w:t>69</w:t>
+        <w:t>52</w:t>
       </w:r>
     </w:p>
     <w:p>
@@ -4023,7 +4154,7 @@
           <w:rFonts w:ascii="Times New Roman" w:hAnsi="Times New Roman"/>
           <w:sz w:val="24"/>
         </w:rPr>
-        <w:t>Bảng 28. Ma trận đối soát kiểm thử Golden Test Cases (TC1 – TC8)</w:t>
+        <w:t>Bảng 28. Tổng hợp các bộ dữ liệu thực nghiệm chuẩn bài báo</w:t>
       </w:r>
       <w:r>
         <w:rPr>
@@ -4031,7 +4162,7 @@
           <w:sz w:val="24"/>
         </w:rPr>
         <w:tab/>
-        <w:t>72</w:t>
+        <w:t>73</w:t>
       </w:r>
     </w:p>
     <w:p>
@@ -4046,7 +4177,7 @@
           <w:rFonts w:ascii="Times New Roman" w:hAnsi="Times New Roman"/>
           <w:sz w:val="24"/>
         </w:rPr>
-        <w:t>Bảng 29. Bảng phân công trách nhiệm và khối lượng công việc</w:t>
+        <w:t>Bảng 29. Ma trận đối soát kiểm thử Golden Test Cases (TC1 – TC8)</w:t>
       </w:r>
       <w:r>
         <w:rPr>
@@ -4054,7 +4185,30 @@
           <w:sz w:val="24"/>
         </w:rPr>
         <w:tab/>
-        <w:t>79</w:t>
+        <w:t>76</w:t>
+      </w:r>
+    </w:p>
+    <w:p>
+      <w:pPr>
+        <w:tabs>
+          <w:tab w:pos="9071" w:val="left"/>
+        </w:tabs>
+        <w:spacing w:line="288" w:lineRule="auto" w:after="60"/>
+      </w:pPr>
+      <w:r>
+        <w:rPr>
+          <w:rFonts w:ascii="Times New Roman" w:hAnsi="Times New Roman"/>
+          <w:sz w:val="24"/>
+        </w:rPr>
+        <w:t>Bảng 30. Bảng phân công trách nhiệm và khối lượng công việc</w:t>
+      </w:r>
+      <w:r>
+        <w:rPr>
+          <w:rFonts w:ascii="Times New Roman" w:hAnsi="Times New Roman"/>
+          <w:sz w:val="24"/>
+        </w:rPr>
+        <w:tab/>
+        <w:t>83</w:t>
       </w:r>
     </w:p>
     <w:p>
@@ -4155,7 +4309,7 @@
           <w:color w:val="1E293B"/>
           <w:sz w:val="26"/>
         </w:rPr>
-        <w:t>Xuất phát từ ý nghĩa học thuật tiên phong và giá trị ứng dụng thực tiễn to lớn đó, nhóm sinh viên chúng em thực hiện đề tài: 'Nghiên cứu thuật toán DHOPM và xây dựng ứng dụng trực quan hóa khai phá mẫu độ chiếm dụng cao trên luồng dữ liệu'. Đồ án không chỉ dừng lại ở việc chứng minh và làm chủ các công thức toán học, mà còn tập trung xây dựng phần mềm DHOPM Stream Visualizer hoàn chỉnh trên Java 21 và JavaFX, áp dụng 9 mẫu thiết kế phần mềm GoF chuẩn công nghiệp, mang lại một công cụ trực quan hóa sống động phục vụ nghiên cứu và giảng dạy đại học.</w:t>
+        <w:t>Xuất phát từ ý nghĩa học thuật tiên phong và giá trị ứng dụng thực tiễn to lớn đó, nhóm sinh viên chúng em thực hiện đề tài: 'Nghiên cứu thuật toán DHOPM và xây dựng ứng dụng trực quan hóa khai phá mẫu độ chiếm dụng cao trên luồng dữ liệu'. Đồ án không chỉ dừng lại ở việc chứng minh và làm chủ các công thức toán học, mà còn tập trung xây dựng phần mềm DHOPM Stream Visualizer hoàn chỉnh trên Java 21 và JavaFX, áp dụng chuẩn mực Hợp đồng giao thức kết nối Frontend ↔ Backend (FE Contract Protocol 1) qua TCP Socket 7079 JSON Lines, kết hợp 9 mẫu thiết kế phần mềm GoF, mang lại một công cụ trực quan hóa sống động phục vụ nghiên cứu và giảng dạy đại học.</w:t>
       </w:r>
     </w:p>
     <w:p>
@@ -4368,7 +4522,7 @@
           <w:color w:val="1E293B"/>
           <w:sz w:val="26"/>
         </w:rPr>
-        <w:t>- Mục tiêu kỹ thuật: Áp dụng 9 Mẫu thiết kế phần mềm GoF, phân tầng Clean MVC, kiểm thử tự động đạt 100% (48/48 unit tests PASS).</w:t>
+        <w:t>- Mục tiêu giao thức &amp; kiến trúc: Áp dụng Hợp đồng kết nối FE ↔ BE chuẩn Protocol 1 qua TCP Socket 7079 JSON Lines (CONTRACT.md), 9 Mẫu thiết kế phần mềm GoF, phân tầng Clean MVC, kiểm thử tự động đạt 100% (51/51 unit tests PASS).</w:t>
       </w:r>
     </w:p>
     <w:p>
@@ -6119,7 +6273,7 @@
           <w:color w:val="1E293B"/>
           <w:sz w:val="26"/>
         </w:rPr>
-        <w:t>3.1.1. Yêu cầu chức năng: Cấu hình tham số f và minSup (hỗ trợ nhập bàn phím hai chiều); nạp luồng giao dịch; mô phỏng khai phá 3 pha; trực quan hóa DHO-List; hiển thị bảng mẫu có Support (tx / %); quét Benchmark Sweep đa ngưỡng minSup; khai phá Big Data Tson/SPMF với nút Dừng và ETA; cảnh báo dữ liệu dày; lưu trữ lịch sử bằng Memento; và ghi nhật ký tính toán chi tiết.</w:t>
+        <w:t>3.1.1. Yêu cầu chức năng: Cấu hình tham số f và minSup (hỗ trợ nhập bàn phím hai chiều); nạp luồng giao dịch; mô phỏng khai phá 3 pha; trực quan hóa DHO-List; hiển thị bảng mẫu có Support (tx / %); quét Benchmark Sweep đa ngưỡng minSup; khai phá Big Data Tson/SPMF với nút Dừng và ETA; cảnh báo dữ liệu dày; lưu trữ lịch sử bằng Memento; ghi nhật ký tính toán chi tiết; và kết nối Backend qua Socket TCP 7079 theo FE Contract Protocol 1.</w:t>
       </w:r>
     </w:p>
     <w:p>
@@ -6594,7 +6748,7 @@
                 <w:color w:val="1E293B"/>
                 <w:sz w:val="24"/>
               </w:rPr>
-              <w:t>TamSimulationBridge, TsonV1Bridge</w:t>
+              <w:t>TamSimulationBridge, TsonV1Bridge, TsonTcpContractBridge</w:t>
             </w:r>
           </w:p>
         </w:tc>
@@ -14271,6 +14425,380 @@
     </w:p>
     <w:p>
       <w:pPr>
+        <w:spacing w:before="0" w:after="120" w:line="312" w:lineRule="auto"/>
+        <w:jc w:val="center"/>
+      </w:pPr>
+      <w:r>
+        <w:rPr>
+          <w:rFonts w:ascii="Times New Roman" w:hAnsi="Times New Roman"/>
+          <w:b w:val="0"/>
+          <w:i/>
+          <w:color w:val="1E293B"/>
+          <w:sz w:val="26"/>
+        </w:rPr>
+        <w:t>Bảng 21. Bảng đặc tả Use case Kết nối Backend qua TCP Socket 7079 theo Contract Protocol 1</w:t>
+      </w:r>
+    </w:p>
+    <w:tbl>
+      <w:tblPr>
+        <w:tblW w:type="auto" w:w="0"/>
+        <w:jc w:val="center"/>
+        <w:tblLook w:firstColumn="1" w:firstRow="1" w:lastColumn="0" w:lastRow="0" w:noHBand="0" w:noVBand="1" w:val="04A0"/>
+        <w:tblBorders>
+          <w:top w:val="single" w:sz="4" w:space="0" w:color="D1D5DB"/>
+          <w:bottom w:val="single" w:sz="4" w:space="0" w:color="D1D5DB"/>
+          <w:left w:val="single" w:sz="4" w:space="0" w:color="D1D5DB"/>
+          <w:right w:val="single" w:sz="4" w:space="0" w:color="D1D5DB"/>
+          <w:insideH w:val="single" w:sz="4" w:space="0" w:color="D1D5DB"/>
+          <w:insideV w:val="single" w:sz="4" w:space="0" w:color="D1D5DB"/>
+        </w:tblBorders>
+      </w:tblPr>
+      <w:tblGrid>
+        <w:gridCol w:w="4535"/>
+        <w:gridCol w:w="4535"/>
+      </w:tblGrid>
+      <w:tr>
+        <w:tc>
+          <w:tcPr>
+            <w:tcW w:type="dxa" w:w="1984"/>
+            <w:shd w:fill="F1F5F9"/>
+            <w:tcMar>
+              <w:top w:w="120" w:type="dxa"/>
+              <w:bottom w:w="120" w:type="dxa"/>
+              <w:left w:w="150" w:type="dxa"/>
+              <w:right w:w="150" w:type="dxa"/>
+            </w:tcMar>
+          </w:tcPr>
+          <w:p>
+            <w:pPr>
+              <w:spacing w:after="0" w:before="0"/>
+              <w:jc w:val="center"/>
+            </w:pPr>
+            <w:r>
+              <w:rPr>
+                <w:rFonts w:ascii="Times New Roman" w:hAnsi="Times New Roman"/>
+                <w:b/>
+                <w:color w:val="0F172A"/>
+                <w:sz w:val="24"/>
+              </w:rPr>
+              <w:t>Thuộc tính</w:t>
+            </w:r>
+          </w:p>
+        </w:tc>
+        <w:tc>
+          <w:tcPr>
+            <w:tcW w:type="dxa" w:w="6803"/>
+            <w:shd w:fill="F1F5F9"/>
+            <w:tcMar>
+              <w:top w:w="120" w:type="dxa"/>
+              <w:bottom w:w="120" w:type="dxa"/>
+              <w:left w:w="150" w:type="dxa"/>
+              <w:right w:w="150" w:type="dxa"/>
+            </w:tcMar>
+          </w:tcPr>
+          <w:p>
+            <w:pPr>
+              <w:spacing w:after="0" w:before="0"/>
+              <w:jc w:val="center"/>
+            </w:pPr>
+            <w:r>
+              <w:rPr>
+                <w:rFonts w:ascii="Times New Roman" w:hAnsi="Times New Roman"/>
+                <w:b/>
+                <w:color w:val="0F172A"/>
+                <w:sz w:val="24"/>
+              </w:rPr>
+              <w:t>Chi tiết đặc tả Use case</w:t>
+            </w:r>
+          </w:p>
+        </w:tc>
+      </w:tr>
+      <w:tr>
+        <w:tc>
+          <w:tcPr>
+            <w:tcW w:type="dxa" w:w="1984"/>
+            <w:shd w:fill="FFFFFF"/>
+            <w:tcMar>
+              <w:top w:w="100" w:type="dxa"/>
+              <w:bottom w:w="100" w:type="dxa"/>
+              <w:left w:w="140" w:type="dxa"/>
+              <w:right w:w="140" w:type="dxa"/>
+            </w:tcMar>
+          </w:tcPr>
+          <w:p>
+            <w:pPr>
+              <w:spacing w:after="0" w:before="0"/>
+              <w:jc w:val="center"/>
+            </w:pPr>
+            <w:r>
+              <w:rPr>
+                <w:rFonts w:ascii="Times New Roman" w:hAnsi="Times New Roman"/>
+                <w:color w:val="1E293B"/>
+                <w:sz w:val="24"/>
+              </w:rPr>
+              <w:t>Tên Use case</w:t>
+            </w:r>
+          </w:p>
+        </w:tc>
+        <w:tc>
+          <w:tcPr>
+            <w:tcW w:type="dxa" w:w="6803"/>
+            <w:shd w:fill="FFFFFF"/>
+            <w:tcMar>
+              <w:top w:w="100" w:type="dxa"/>
+              <w:bottom w:w="100" w:type="dxa"/>
+              <w:left w:w="140" w:type="dxa"/>
+              <w:right w:w="140" w:type="dxa"/>
+            </w:tcMar>
+          </w:tcPr>
+          <w:p>
+            <w:pPr>
+              <w:spacing w:after="0" w:before="0"/>
+              <w:jc w:val="left"/>
+            </w:pPr>
+            <w:r>
+              <w:rPr>
+                <w:rFonts w:ascii="Times New Roman" w:hAnsi="Times New Roman"/>
+                <w:color w:val="1E293B"/>
+                <w:sz w:val="24"/>
+              </w:rPr>
+              <w:t>Kết nối Backend qua TCP Socket 7079 theo Contract Protocol 1</w:t>
+            </w:r>
+          </w:p>
+        </w:tc>
+      </w:tr>
+      <w:tr>
+        <w:tc>
+          <w:tcPr>
+            <w:tcW w:type="dxa" w:w="1984"/>
+            <w:shd w:fill="F8FAFC"/>
+            <w:tcMar>
+              <w:top w:w="100" w:type="dxa"/>
+              <w:bottom w:w="100" w:type="dxa"/>
+              <w:left w:w="140" w:type="dxa"/>
+              <w:right w:w="140" w:type="dxa"/>
+            </w:tcMar>
+          </w:tcPr>
+          <w:p>
+            <w:pPr>
+              <w:spacing w:after="0" w:before="0"/>
+              <w:jc w:val="center"/>
+            </w:pPr>
+            <w:r>
+              <w:rPr>
+                <w:rFonts w:ascii="Times New Roman" w:hAnsi="Times New Roman"/>
+                <w:color w:val="1E293B"/>
+                <w:sz w:val="24"/>
+              </w:rPr>
+              <w:t>Mô tả</w:t>
+            </w:r>
+          </w:p>
+        </w:tc>
+        <w:tc>
+          <w:tcPr>
+            <w:tcW w:type="dxa" w:w="6803"/>
+            <w:shd w:fill="F8FAFC"/>
+            <w:tcMar>
+              <w:top w:w="100" w:type="dxa"/>
+              <w:bottom w:w="100" w:type="dxa"/>
+              <w:left w:w="140" w:type="dxa"/>
+              <w:right w:w="140" w:type="dxa"/>
+            </w:tcMar>
+          </w:tcPr>
+          <w:p>
+            <w:pPr>
+              <w:spacing w:after="0" w:before="0"/>
+              <w:jc w:val="left"/>
+            </w:pPr>
+            <w:r>
+              <w:rPr>
+                <w:rFonts w:ascii="Times New Roman" w:hAnsi="Times New Roman"/>
+                <w:color w:val="1E293B"/>
+                <w:sz w:val="24"/>
+              </w:rPr>
+              <w:t>Frontend thiết lập kết nối TCP Socket tới Backend dhopm-cli trên cổng 7079, gửi Handshake hello, nhận danh sách lệnh và thực thi khai phá không phụ thuộc class Java.</w:t>
+            </w:r>
+          </w:p>
+        </w:tc>
+      </w:tr>
+      <w:tr>
+        <w:tc>
+          <w:tcPr>
+            <w:tcW w:type="dxa" w:w="1984"/>
+            <w:shd w:fill="FFFFFF"/>
+            <w:tcMar>
+              <w:top w:w="100" w:type="dxa"/>
+              <w:bottom w:w="100" w:type="dxa"/>
+              <w:left w:w="140" w:type="dxa"/>
+              <w:right w:w="140" w:type="dxa"/>
+            </w:tcMar>
+          </w:tcPr>
+          <w:p>
+            <w:pPr>
+              <w:spacing w:after="0" w:before="0"/>
+              <w:jc w:val="center"/>
+            </w:pPr>
+            <w:r>
+              <w:rPr>
+                <w:rFonts w:ascii="Times New Roman" w:hAnsi="Times New Roman"/>
+                <w:color w:val="1E293B"/>
+                <w:sz w:val="24"/>
+              </w:rPr>
+              <w:t>Tác nhân chính</w:t>
+            </w:r>
+          </w:p>
+        </w:tc>
+        <w:tc>
+          <w:tcPr>
+            <w:tcW w:type="dxa" w:w="6803"/>
+            <w:shd w:fill="FFFFFF"/>
+            <w:tcMar>
+              <w:top w:w="100" w:type="dxa"/>
+              <w:bottom w:w="100" w:type="dxa"/>
+              <w:left w:w="140" w:type="dxa"/>
+              <w:right w:w="140" w:type="dxa"/>
+            </w:tcMar>
+          </w:tcPr>
+          <w:p>
+            <w:pPr>
+              <w:spacing w:after="0" w:before="0"/>
+              <w:jc w:val="left"/>
+            </w:pPr>
+            <w:r>
+              <w:rPr>
+                <w:rFonts w:ascii="Times New Roman" w:hAnsi="Times New Roman"/>
+                <w:color w:val="1E293B"/>
+                <w:sz w:val="24"/>
+              </w:rPr>
+              <w:t>Kỹ sư dữ liệu, Nhà nghiên cứu</w:t>
+            </w:r>
+          </w:p>
+        </w:tc>
+      </w:tr>
+      <w:tr>
+        <w:tc>
+          <w:tcPr>
+            <w:tcW w:type="dxa" w:w="1984"/>
+            <w:shd w:fill="F8FAFC"/>
+            <w:tcMar>
+              <w:top w:w="100" w:type="dxa"/>
+              <w:bottom w:w="100" w:type="dxa"/>
+              <w:left w:w="140" w:type="dxa"/>
+              <w:right w:w="140" w:type="dxa"/>
+            </w:tcMar>
+          </w:tcPr>
+          <w:p>
+            <w:pPr>
+              <w:spacing w:after="0" w:before="0"/>
+              <w:jc w:val="center"/>
+            </w:pPr>
+            <w:r>
+              <w:rPr>
+                <w:rFonts w:ascii="Times New Roman" w:hAnsi="Times New Roman"/>
+                <w:color w:val="1E293B"/>
+                <w:sz w:val="24"/>
+              </w:rPr>
+              <w:t>Luồng chính</w:t>
+            </w:r>
+          </w:p>
+        </w:tc>
+        <w:tc>
+          <w:tcPr>
+            <w:tcW w:type="dxa" w:w="6803"/>
+            <w:shd w:fill="F8FAFC"/>
+            <w:tcMar>
+              <w:top w:w="100" w:type="dxa"/>
+              <w:bottom w:w="100" w:type="dxa"/>
+              <w:left w:w="140" w:type="dxa"/>
+              <w:right w:w="140" w:type="dxa"/>
+            </w:tcMar>
+          </w:tcPr>
+          <w:p>
+            <w:pPr>
+              <w:spacing w:after="0" w:before="0"/>
+              <w:jc w:val="left"/>
+            </w:pPr>
+            <w:r>
+              <w:rPr>
+                <w:rFonts w:ascii="Times New Roman" w:hAnsi="Times New Roman"/>
+                <w:color w:val="1E293B"/>
+                <w:sz w:val="24"/>
+              </w:rPr>
+              <w:t>1) Hệ thống thử mở Socket tới 127.0.0.1:7079 (quét LAN nếu cần).</w:t>
+              <w:br/>
+              <w:t>2) Gửi handshake: {'id':0,'v':1,'cmd':'hello'}.</w:t>
+              <w:br/>
+              <w:t>3) Nhận phản hồi {'protocol':1, 'ok':true} -&gt; xác nhận kết nối.</w:t>
+              <w:br/>
+              <w:t>4) Gửi các lệnh 'mine', 'window', 'inspect' bằng JSON Lines và nhận kết quả.</w:t>
+              <w:br/>
+              <w:t>5) Tự động mirror bản sao kết quả về thư mục mine/ cục bộ (R14).</w:t>
+            </w:r>
+          </w:p>
+        </w:tc>
+      </w:tr>
+      <w:tr>
+        <w:tc>
+          <w:tcPr>
+            <w:tcW w:type="dxa" w:w="1984"/>
+            <w:shd w:fill="FFFFFF"/>
+            <w:tcMar>
+              <w:top w:w="100" w:type="dxa"/>
+              <w:bottom w:w="100" w:type="dxa"/>
+              <w:left w:w="140" w:type="dxa"/>
+              <w:right w:w="140" w:type="dxa"/>
+            </w:tcMar>
+          </w:tcPr>
+          <w:p>
+            <w:pPr>
+              <w:spacing w:after="0" w:before="0"/>
+              <w:jc w:val="center"/>
+            </w:pPr>
+            <w:r>
+              <w:rPr>
+                <w:rFonts w:ascii="Times New Roman" w:hAnsi="Times New Roman"/>
+                <w:color w:val="1E293B"/>
+                <w:sz w:val="24"/>
+              </w:rPr>
+              <w:t>Luồng ngoại lệ</w:t>
+            </w:r>
+          </w:p>
+        </w:tc>
+        <w:tc>
+          <w:tcPr>
+            <w:tcW w:type="dxa" w:w="6803"/>
+            <w:shd w:fill="FFFFFF"/>
+            <w:tcMar>
+              <w:top w:w="100" w:type="dxa"/>
+              <w:bottom w:w="100" w:type="dxa"/>
+              <w:left w:w="140" w:type="dxa"/>
+              <w:right w:w="140" w:type="dxa"/>
+            </w:tcMar>
+          </w:tcPr>
+          <w:p>
+            <w:pPr>
+              <w:spacing w:after="0" w:before="0"/>
+              <w:jc w:val="left"/>
+            </w:pPr>
+            <w:r>
+              <w:rPr>
+                <w:rFonts w:ascii="Times New Roman" w:hAnsi="Times New Roman"/>
+                <w:color w:val="1E293B"/>
+                <w:sz w:val="24"/>
+              </w:rPr>
+              <w:t>Không tìm thấy Backend TCP -&gt; Tự động chuyển tiếp sang chế độ In-process Fallback an toàn.</w:t>
+            </w:r>
+          </w:p>
+        </w:tc>
+      </w:tr>
+    </w:tbl>
+    <w:p>
+      <w:pPr>
+        <w:spacing w:after="120"/>
+      </w:pPr>
+    </w:p>
+    <w:p>
+      <w:pPr>
         <w:keepNext/>
         <w:spacing w:before="200" w:after="80"/>
         <w:jc w:val="left"/>
@@ -14299,7 +14827,7 @@
           <w:color w:val="1E293B"/>
           <w:sz w:val="26"/>
         </w:rPr>
-        <w:t>Bảng 21. Cấu trúc dữ liệu thực thể PatternResult</w:t>
+        <w:t>Bảng 22. Cấu trúc dữ liệu thực thể PatternResult</w:t>
       </w:r>
     </w:p>
     <w:tbl>
@@ -14983,7 +15511,7 @@
           <w:color w:val="1E293B"/>
           <w:sz w:val="26"/>
         </w:rPr>
-        <w:t>Bảng 22. Cấu trúc dữ liệu thực thể DHOEntry</w:t>
+        <w:t>Bảng 23. Cấu trúc dữ liệu thực thể DHOEntry</w:t>
       </w:r>
     </w:p>
     <w:tbl>
@@ -15267,7 +15795,7 @@
           <w:color w:val="1E293B"/>
           <w:sz w:val="26"/>
         </w:rPr>
-        <w:t>Bảng 23. Cấu trúc dữ liệu thực thể MiningRunMemento</w:t>
+        <w:t>Bảng 24. Cấu trúc dữ liệu thực thể MiningRunMemento</w:t>
       </w:r>
     </w:p>
     <w:tbl>
@@ -16351,7 +16879,7 @@
           <w:color w:val="1E293B"/>
           <w:sz w:val="26"/>
         </w:rPr>
-        <w:t>Bảng 24. Cấu trúc dữ liệu thực thể MinSupSweepResult (Java Record)</w:t>
+        <w:t>Bảng 25. Cấu trúc dữ liệu thực thể MinSupSweepResult (Java Record)</w:t>
       </w:r>
     </w:p>
     <w:tbl>
@@ -17035,7 +17563,7 @@
           <w:color w:val="1E293B"/>
           <w:sz w:val="26"/>
         </w:rPr>
-        <w:t>Bảng 25. Cấu trúc dữ liệu thực thể CalculationLogEntry (Java Record)</w:t>
+        <w:t>Bảng 26. Cấu trúc dữ liệu thực thể CalculationLogEntry (Java Record)</w:t>
       </w:r>
     </w:p>
     <w:tbl>
@@ -17639,7 +18167,7 @@
           <w:color w:val="1E293B"/>
           <w:sz w:val="26"/>
         </w:rPr>
-        <w:t>Bảng 26. Cấu trúc dữ liệu thực thể Transaction</w:t>
+        <w:t>Bảng 27. Cấu trúc dữ liệu thực thể Transaction</w:t>
       </w:r>
     </w:p>
     <w:tbl>
@@ -17913,6 +18441,135 @@
     <w:p>
       <w:pPr>
         <w:keepNext/>
+        <w:spacing w:before="200" w:after="80"/>
+        <w:jc w:val="left"/>
+      </w:pPr>
+      <w:r>
+        <w:rPr>
+          <w:rFonts w:ascii="Times New Roman" w:hAnsi="Times New Roman"/>
+          <w:b/>
+          <w:i/>
+          <w:color w:val="334155"/>
+          <w:sz w:val="26"/>
+        </w:rPr>
+        <w:t>3.2.5. Hợp đồng giao thức kết nối Frontend ↔ Backend (FE Contract Protocol 1)</w:t>
+      </w:r>
+    </w:p>
+    <w:p>
+      <w:pPr>
+        <w:spacing w:before="0" w:after="120" w:line="312" w:lineRule="auto"/>
+        <w:jc w:val="both"/>
+      </w:pPr>
+      <w:r>
+        <w:rPr>
+          <w:rFonts w:ascii="Times New Roman" w:hAnsi="Times New Roman"/>
+          <w:b w:val="0"/>
+          <w:i w:val="0"/>
+          <w:color w:val="1E293B"/>
+          <w:sz w:val="26"/>
+        </w:rPr>
+        <w:t>Nhằm đảm bảo sự độc lập hoàn toàn giữa nhóm phát triển Frontend (Tâm - repo javanc) và Backend (Sơn - repo JVNC), hệ thống thiết lập Hợp đồng giao thức kết nối FE ↔ BE (CONTRACT.md / 08-FE-CONTRACT.md):</w:t>
+      </w:r>
+    </w:p>
+    <w:p>
+      <w:pPr>
+        <w:spacing w:before="0" w:after="120" w:line="312" w:lineRule="auto"/>
+        <w:jc w:val="both"/>
+      </w:pPr>
+      <w:r>
+        <w:rPr>
+          <w:rFonts w:ascii="Times New Roman" w:hAnsi="Times New Roman"/>
+          <w:b w:val="0"/>
+          <w:i w:val="0"/>
+          <w:color w:val="1E293B"/>
+          <w:sz w:val="26"/>
+        </w:rPr>
+        <w:t>- Ranh giới độc lập (R1, R2): Frontend không import bất kỳ class Java nào từ backend (dhopm.*), không phụ thuộc jar backend. Giao tiếp duy nhất thông qua Manager CLI/API (dhopm-cli) qua mạng Socket TCP hoặc stdio JSONL.</w:t>
+      </w:r>
+    </w:p>
+    <w:p>
+      <w:pPr>
+        <w:spacing w:before="0" w:after="120" w:line="312" w:lineRule="auto"/>
+        <w:jc w:val="both"/>
+      </w:pPr>
+      <w:r>
+        <w:rPr>
+          <w:rFonts w:ascii="Times New Roman" w:hAnsi="Times New Roman"/>
+          <w:b w:val="0"/>
+          <w:i w:val="0"/>
+          <w:color w:val="1E293B"/>
+          <w:sz w:val="26"/>
+        </w:rPr>
+        <w:t>- Giao thức Protocol 1: Định dạng dữ liệu là JSON Lines (1 request / 1 dòng, 1 response / 1 dòng), mỗi gói tin đều mang thuộc tính 'v': 1. Khung phong bì phản hồi chuẩn: {'id':..., 'v':1, 'ok':true/false, ...}.</w:t>
+      </w:r>
+    </w:p>
+    <w:p>
+      <w:pPr>
+        <w:spacing w:before="0" w:after="120" w:line="312" w:lineRule="auto"/>
+        <w:jc w:val="both"/>
+      </w:pPr>
+      <w:r>
+        <w:rPr>
+          <w:rFonts w:ascii="Times New Roman" w:hAnsi="Times New Roman"/>
+          <w:b w:val="0"/>
+          <w:i w:val="0"/>
+          <w:color w:val="1E293B"/>
+          <w:sz w:val="26"/>
+        </w:rPr>
+        <w:t>- Cổng kết nối TCP: Mặc định localhost:7079. Backend chủ động mở cổng (serve) chờ kết nối; Frontend chủ động dò tìm từ 127.0.0.1 sang mạng LAN nội bộ.</w:t>
+      </w:r>
+    </w:p>
+    <w:p>
+      <w:pPr>
+        <w:spacing w:before="0" w:after="120" w:line="312" w:lineRule="auto"/>
+        <w:jc w:val="both"/>
+      </w:pPr>
+      <w:r>
+        <w:rPr>
+          <w:rFonts w:ascii="Times New Roman" w:hAnsi="Times New Roman"/>
+          <w:b w:val="0"/>
+          <w:i w:val="0"/>
+          <w:color w:val="1E293B"/>
+          <w:sz w:val="26"/>
+        </w:rPr>
+        <w:t>- Quy trình bắt tay 3 bước: 1) Mở socket TCP 7079 -&gt; 2) Gửi {'id':0,'v':1,'cmd':'hello'} -&gt; 3) Backend xác nhận 'protocol': 1, trả về danh sách phiên bản v1, v2, v3 sẵn sàng và danh sách lệnh hỗ trợ.</w:t>
+      </w:r>
+    </w:p>
+    <w:p>
+      <w:pPr>
+        <w:spacing w:before="0" w:after="120" w:line="312" w:lineRule="auto"/>
+        <w:jc w:val="both"/>
+      </w:pPr>
+      <w:r>
+        <w:rPr>
+          <w:rFonts w:ascii="Times New Roman" w:hAnsi="Times New Roman"/>
+          <w:b w:val="0"/>
+          <w:i w:val="0"/>
+          <w:color w:val="1E293B"/>
+          <w:sz w:val="26"/>
+        </w:rPr>
+        <w:t>- Bộ lệnh hoàn chỉnh: 'window' (tra cứu cửa sổ suy giảm), 'mine' (khai phá tập dữ liệu), 'detail' (top mẫu DO), 'stream' (mô phỏng từng bước), 'inspect' (thống kê dataset), 'golden' (bộ testcase TC1-8), 'fetch' (tải file kết quả).</w:t>
+      </w:r>
+    </w:p>
+    <w:p>
+      <w:pPr>
+        <w:spacing w:before="0" w:after="120" w:line="312" w:lineRule="auto"/>
+        <w:jc w:val="both"/>
+      </w:pPr>
+      <w:r>
+        <w:rPr>
+          <w:rFonts w:ascii="Times New Roman" w:hAnsi="Times New Roman"/>
+          <w:b w:val="0"/>
+          <w:i w:val="0"/>
+          <w:color w:val="1E293B"/>
+          <w:sz w:val="26"/>
+        </w:rPr>
+        <w:t>- Ràng buộc lưu trữ cục bộ (R14 / D48): Khi request có 'export': true hoặc 'isLog': true, Backend lưu kết quả vào file 'mine_&lt;yy-MM-dd&gt;_&lt;NNN&gt;.txt' và Frontend tự động mirror một bản sao cục bộ vào thư mục 'mine/' để tránh phụ thuộc Backend.</w:t>
+      </w:r>
+    </w:p>
+    <w:p>
+      <w:pPr>
+        <w:keepNext/>
         <w:spacing w:before="360" w:after="160"/>
         <w:jc w:val="left"/>
       </w:pPr>
@@ -17955,7 +18612,7 @@
           <w:color w:val="1E293B"/>
           <w:sz w:val="26"/>
         </w:rPr>
-        <w:t>Mã nguồn tuân thủ Clean Architecture của Maven, phân tầng rõ rệt: vn.edu.dlu.dhopm.core (thuật toán lõi), .bridge (mẫu Adapter &amp; Bridge), .history (mẫu Memento &amp; Singleton), .log (mẫu Observer &amp; Singleton), .ui.controller (bộ điều khiển JavaFX), và .view (tệp main.fxml cùng style.css).</w:t>
+        <w:t>Mã nguồn tuân thủ Clean Architecture của Maven, phân tầng rõ rệt: vn.edu.dlu.dhopm.core (thuật toán lõi), .bridge (mẫu Adapter, Bridge, DhopmContractTcpClient), .history (mẫu Memento &amp; Singleton), .log (mẫu Observer &amp; Singleton), .ui.controller (bộ điều khiển JavaFX), và .view (tệp main.fxml cùng style.css).</w:t>
       </w:r>
     </w:p>
     <w:p>
@@ -17987,7 +18644,7 @@
           <w:color w:val="1E293B"/>
           <w:sz w:val="26"/>
         </w:rPr>
-        <w:t>Thuật toán lõi DHOPMEngine cài đặt theo mẫu Template Method, tuân thủ 3 pha bất biến:</w:t>
+        <w:t>4.2.1. Thuật toán lõi DHOPMEngine cài đặt theo mẫu Template Method, tuân thủ 3 pha bất biến: Construct -&gt; Reconstruct -&gt; DFS Mining.</w:t>
       </w:r>
     </w:p>
     <w:p>
@@ -18003,7 +18660,7 @@
           <w:color w:val="1E293B"/>
           <w:sz w:val="26"/>
         </w:rPr>
-        <w:t xml:space="preserve">    - Pha 1 (Construct): Đọc luồng dữ liệu 1 lần, ghi nhận cặp &lt;TID, |Td|&gt; vào DHO-List.</w:t>
+        <w:t>4.2.2. Dịch vụ MinSupSweepService tự động chạy dải ngưỡng ∂ từ 0.05 đến 0.50, đo lường thời gian chạy và bộ nhớ Heap RAM đã sử dụng.</w:t>
       </w:r>
     </w:p>
     <w:p>
@@ -18019,7 +18676,7 @@
           <w:color w:val="1E293B"/>
           <w:sz w:val="26"/>
         </w:rPr>
-        <w:t xml:space="preserve">    - Pha 2 (Reconstruct): Sắp xếp thứ tự các mục theo Support tăng dần, tính DO và DUBO.</w:t>
+        <w:t>4.2.3. Lớp MiningHistoryManager (Singleton &amp; Caretaker) lưu trữ snapshot các lần chạy bằng MiningRunMemento, hỗ trợ phục hồi bảng kết quả kèm tính toán tỷ lệ % Support chuẩn xác.</w:t>
       </w:r>
     </w:p>
     <w:p>
@@ -18035,39 +18692,7 @@
           <w:color w:val="1E293B"/>
           <w:sz w:val="26"/>
         </w:rPr>
-        <w:t xml:space="preserve">    - Pha 3 (DFS Mining): Duyệt cây đệ quy theo chiều sâu, cắt tỉa bằng cận trên DUBO và thu thập các mẫu DHOP.</w:t>
-      </w:r>
-    </w:p>
-    <w:p>
-      <w:pPr>
-        <w:spacing w:before="0" w:after="120" w:line="312" w:lineRule="auto"/>
-        <w:jc w:val="both"/>
-      </w:pPr>
-      <w:r>
-        <w:rPr>
-          <w:rFonts w:ascii="Times New Roman" w:hAnsi="Times New Roman"/>
-          <w:b w:val="0"/>
-          <w:i w:val="0"/>
-          <w:color w:val="1E293B"/>
-          <w:sz w:val="26"/>
-        </w:rPr>
-        <w:t>Lớp MinSupSweepService tự động chạy dải ngưỡng ∂ từ 0.05 đến 0.50, đo lường thời gian chạy (System.nanoTime()) và bộ nhớ Heap RAM đã sử dụng.</w:t>
-      </w:r>
-    </w:p>
-    <w:p>
-      <w:pPr>
-        <w:spacing w:before="0" w:after="120" w:line="312" w:lineRule="auto"/>
-        <w:jc w:val="both"/>
-      </w:pPr>
-      <w:r>
-        <w:rPr>
-          <w:rFonts w:ascii="Times New Roman" w:hAnsi="Times New Roman"/>
-          <w:b w:val="0"/>
-          <w:i w:val="0"/>
-          <w:color w:val="1E293B"/>
-          <w:sz w:val="26"/>
-        </w:rPr>
-        <w:t>Lớp MiningHistoryManager (Singleton &amp; Caretaker) lưu trữ snapshot các lần chạy bằng MiningRunMemento, hỗ trợ phục hồi bảng kết quả kèm tính toán tỷ lệ % Support chuẩn xác.</w:t>
+        <w:t>4.2.4. Phân hệ kết nối Backend qua TCP Socket (DhopmContractTcpClient &amp; TsonTcpContractBridge): Cài đặt bộ client TCP Socket thuần túy trong Java (Zero-dependency JSON parser/builder), thực hiện handshake hello, gửi lệnh mine, window, fetch theo đúng Contract Protocol 1. Đồng thời trang bị cơ chế tự động fallback sang In-process Engine khi Backend offline, đảm bảo trải nghiệm người dùng luôn thông suốt.</w:t>
       </w:r>
     </w:p>
     <w:p>
@@ -18243,7 +18868,7 @@
           <w:color w:val="1E293B"/>
           <w:sz w:val="26"/>
         </w:rPr>
-        <w:t>Bảng 27. Tổng hợp các bộ dữ liệu thực nghiệm chuẩn bài báo</w:t>
+        <w:t>Bảng 28. Tổng hợp các bộ dữ liệu thực nghiệm chuẩn bài báo</w:t>
       </w:r>
     </w:p>
     <w:tbl>
@@ -19083,7 +19708,7 @@
           <w:color w:val="1E3A8A"/>
           <w:sz w:val="27"/>
         </w:rPr>
-        <w:t>5.2. Kết quả kiểm thử tự động toàn diện (48 Test Cases)</w:t>
+        <w:t>5.2. Kết quả kiểm thử tự động toàn diện (51 Test Cases)</w:t>
       </w:r>
     </w:p>
     <w:p>
@@ -19099,7 +19724,7 @@
           <w:color w:val="1E293B"/>
           <w:sz w:val="26"/>
         </w:rPr>
-        <w:t>Bộ kiểm thử tự động toàn diện trên nền tảng JUnit 5 đạt kết quả tuyệt đối 48/48 ca kiểm thử thành công (100% BUILD SUCCESS):</w:t>
+        <w:t>Bộ kiểm thử tự động toàn diện trên nền tảng JUnit 5 đạt kết quả tuyệt đối 51/51 ca kiểm thử thành công (100% BUILD SUCCESS):</w:t>
       </w:r>
     </w:p>
     <w:p>
@@ -19163,6 +19788,22 @@
           <w:color w:val="1E293B"/>
           <w:sz w:val="26"/>
         </w:rPr>
+        <w:t>- DhopmContractTcpClientTest (3 tests): Kiểm thử giao thức FE Contract Protocol 1, JSON Lines wire builder và parser.</w:t>
+      </w:r>
+    </w:p>
+    <w:p>
+      <w:pPr>
+        <w:spacing w:before="0" w:after="120" w:line="312" w:lineRule="auto"/>
+        <w:jc w:val="both"/>
+      </w:pPr>
+      <w:r>
+        <w:rPr>
+          <w:rFonts w:ascii="Times New Roman" w:hAnsi="Times New Roman"/>
+          <w:b w:val="0"/>
+          <w:i w:val="0"/>
+          <w:color w:val="1E293B"/>
+          <w:sz w:val="26"/>
+        </w:rPr>
         <w:t>- TsonBridgeIntegrationTest (6 tests): Đối soát 2 động cơ trên dữ liệu chuẩn.</w:t>
       </w:r>
     </w:p>
@@ -19275,7 +19916,7 @@
           <w:color w:val="1E293B"/>
           <w:sz w:val="26"/>
         </w:rPr>
-        <w:t>Bảng 28. Ma trận đối soát kiểm thử Golden Test Cases (TC1 – TC8)</w:t>
+        <w:t>Bảng 29. Ma trận đối soát kiểm thử Golden Test Cases (TC1 – TC8)</w:t>
       </w:r>
     </w:p>
     <w:tbl>
@@ -21111,7 +21752,7 @@
           <w:color w:val="1E293B"/>
           <w:sz w:val="26"/>
         </w:rPr>
-        <w:t>3. Ứng dụng Visualizer toàn diện: Xây dựng thành công phần mềm DHOPM Stream Visualizer bằng JavaFX 21 gồm 6 Tab chức năng, hỗ trợ Support (tx / %), quét Benchmark Sweep tái hiện biểu đồ bài báo, nút Dừng an toàn, ước tính ETA, quản lý lịch sử (Memento) và nhật ký tính toán chi tiết.</w:t>
+        <w:t>3. Hiện thực hóa Hợp đồng FE ↔ BE (CONTRACT.md Protocol 1): Kết nối độc lập qua TCP Socket 7079 JSON Lines, handshake hello, bộ lệnh mine/window/fetch và tự động mirror file kết quả cục bộ.</w:t>
       </w:r>
     </w:p>
     <w:p>
@@ -21127,7 +21768,23 @@
           <w:color w:val="1E293B"/>
           <w:sz w:val="26"/>
         </w:rPr>
-        <w:t>4. Kiểm thử chất lượng cao: Vượt qua 100% bộ 48 ca kiểm thử tự động JUnit 5, đối soát khớp hoàn toàn với số liệu bài báo gốc.</w:t>
+        <w:t>4. Ứng dụng Visualizer toàn diện: Xây dựng thành công phần mềm DHOPM Stream Visualizer bằng JavaFX 21 gồm 6 Tab chức năng, hỗ trợ Support (tx / %), quét Benchmark Sweep tái hiện biểu đồ bài báo, nút Dừng an toàn, ước tính ETA, quản lý lịch sử (Memento) và nhật ký tính toán chi tiết.</w:t>
+      </w:r>
+    </w:p>
+    <w:p>
+      <w:pPr>
+        <w:spacing w:before="0" w:after="120" w:line="312" w:lineRule="auto"/>
+        <w:jc w:val="both"/>
+      </w:pPr>
+      <w:r>
+        <w:rPr>
+          <w:rFonts w:ascii="Times New Roman" w:hAnsi="Times New Roman"/>
+          <w:b w:val="0"/>
+          <w:i w:val="0"/>
+          <w:color w:val="1E293B"/>
+          <w:sz w:val="26"/>
+        </w:rPr>
+        <w:t>5. Kiểm thử chất lượng cao: Vượt qua 100% bộ 51 ca kiểm thử tự động JUnit 5, đối soát khớp hoàn toàn với số liệu bài báo gốc.</w:t>
       </w:r>
     </w:p>
     <w:p>
@@ -21340,6 +21997,22 @@
     </w:p>
     <w:p>
       <w:pPr>
+        <w:spacing w:before="0" w:after="120" w:line="312" w:lineRule="auto"/>
+        <w:jc w:val="both"/>
+      </w:pPr>
+      <w:r>
+        <w:rPr>
+          <w:rFonts w:ascii="Times New Roman" w:hAnsi="Times New Roman"/>
+          <w:b w:val="0"/>
+          <w:i w:val="0"/>
+          <w:color w:val="1E293B"/>
+          <w:sz w:val="26"/>
+        </w:rPr>
+        <w:t>[9] Tson-dev, 'DHOPM Frontend ↔ Backend Contract Specification (CONTRACT.md / Protocol 1)', GitHub Repository https://github.com/Tson-dev/JVNC, 2026.</w:t>
+      </w:r>
+    </w:p>
+    <w:p>
+      <w:pPr>
         <w:keepNext/>
         <w:spacing w:before="360" w:after="160"/>
         <w:jc w:val="left"/>
@@ -21383,7 +22056,7 @@
           <w:color w:val="1E293B"/>
           <w:sz w:val="26"/>
         </w:rPr>
-        <w:t>Bảng 29. Bảng phân công trách nhiệm và khối lượng công việc</w:t>
+        <w:t>Bảng 30. Bảng phân công trách nhiệm và khối lượng công việc</w:t>
       </w:r>
     </w:p>
     <w:tbl>
@@ -21559,15 +22232,15 @@
           <w:p>
             <w:pPr>
               <w:spacing w:after="0" w:before="0"/>
-              <w:jc w:val="center"/>
-            </w:pPr>
-            <w:r>
-              <w:rPr>
-                <w:rFonts w:ascii="Times New Roman" w:hAnsi="Times New Roman"/>
-                <w:color w:val="1E293B"/>
-                <w:sz w:val="24"/>
-              </w:rPr>
-              <w:t>Trưởng nhóm</w:t>
+              <w:jc w:val="left"/>
+            </w:pPr>
+            <w:r>
+              <w:rPr>
+                <w:rFonts w:ascii="Times New Roman" w:hAnsi="Times New Roman"/>
+                <w:color w:val="1E293B"/>
+                <w:sz w:val="24"/>
+              </w:rPr>
+              <w:t>Trưởng nhóm (Frontend)</w:t>
             </w:r>
           </w:p>
         </w:tc>
@@ -21596,12 +22269,14 @@
               <w:t>- Phân tích kiến trúc hệ thống MVC và áp dụng 9 Mẫu thiết kế GoF.</w:t>
               <w:br/>
               <w:t>- Thiết kế và lập trình toàn bộ giao diện JavaFX 6 Tab (main.fxml, style.css, MainController.java).</w:t>
+              <w:br/>
+              <w:t>- Hiện thực hóa Client TCP Socket DhopmContractTcpClient kết nối BE theo Protocol 1 (CONTRACT.md).</w:t>
               <w:br/>
               <w:t>- Cài đặt phân hệ Benchmark Sweep đa ngưỡng và dựng hệ thống đồ thị đối sánh (Fig 6, 11, 13).</w:t>
               <w:br/>
               <w:t>- Hiện thực Memento Pattern và Observer Pattern cho nhật ký tính toán.</w:t>
               <w:br/>
-              <w:t>- Xây dựng bộ 48 ca kiểm thử JUnit 5 và viết báo cáo học thuật hoàn chỉnh.</w:t>
+              <w:t>- Xây dựng bộ 51 ca kiểm thử JUnit 5 và viết báo cáo học thuật hoàn chỉnh.</w:t>
             </w:r>
           </w:p>
         </w:tc>
@@ -21673,15 +22348,15 @@
           <w:p>
             <w:pPr>
               <w:spacing w:after="0" w:before="0"/>
-              <w:jc w:val="center"/>
-            </w:pPr>
-            <w:r>
-              <w:rPr>
-                <w:rFonts w:ascii="Times New Roman" w:hAnsi="Times New Roman"/>
-                <w:color w:val="1E293B"/>
-                <w:sz w:val="24"/>
-              </w:rPr>
-              <w:t>Thành viên</w:t>
+              <w:jc w:val="left"/>
+            </w:pPr>
+            <w:r>
+              <w:rPr>
+                <w:rFonts w:ascii="Times New Roman" w:hAnsi="Times New Roman"/>
+                <w:color w:val="1E293B"/>
+                <w:sz w:val="24"/>
+              </w:rPr>
+              <w:t>Thành viên (Backend)</w:t>
             </w:r>
           </w:p>
         </w:tc>
@@ -21709,7 +22384,9 @@
               </w:rPr>
               <w:t>- Nghiên cứu cơ sở toán học thuật toán DHOPM và cấu trúc Global DHO-List một lần quét.</w:t>
               <w:br/>
-              <w:t>- Hiện thực hóa thuật toán lõi DHOPMEngine và cơ chế cắt tỉa an toàn bằng cận trên DUBO.</w:t>
+              <w:t>- Soạn thảo và chuẩn hóa đặc tả Hợp đồng FE ↔ BE (CONTRACT.md / 08-FE-CONTRACT.md).</w:t>
+              <w:br/>
+              <w:t>- Hiện thực hóa thuật toán lõi DHOPMEngine, server TCP Socket 7079 và các engine V1-V3.</w:t>
               <w:br/>
               <w:t>- Đóng gói và tích hợp động cơ Tson / SPMF Engine xử lý dữ liệu lớn.</w:t>
               <w:br/>
@@ -21827,7 +22504,7 @@
           <w:color w:val="1E293B"/>
           <w:sz w:val="26"/>
         </w:rPr>
-        <w:t xml:space="preserve">   Hệ thống thực thi 48 ca kiểm thử đơn vị với kết quả 100% BUILD SUCCESS.</w:t>
+        <w:t xml:space="preserve">   Hệ thống thực thi 51 ca kiểm thử đơn vị với kết quả 100% BUILD SUCCESS.</w:t>
       </w:r>
     </w:p>
     <w:p>

</xml_diff>

<commit_message>
docs: standardize scientific report formatting and expand 3-phase algorithm slides with diagrams
</commit_message>
<xml_diff>
--- a/docs/BaoCao_DeTai_DHOPM_2312741_NguyenThanhTam.docx
+++ b/docs/BaoCao_DeTai_DHOPM_2312741_NguyenThanhTam.docx
@@ -202,7 +202,7 @@
                 <w:rFonts w:ascii="Times New Roman" w:hAnsi="Times New Roman"/>
                 <w:sz w:val="24"/>
               </w:rPr>
-              <w:t>Nguyễn Hữu Trung Sơn (Phụ trách Core Engine)</w:t>
+              <w:t>Nguyễn Hữu Trung Sơn (Lớp CTK45-PM)</w:t>
             </w:r>
           </w:p>
         </w:tc>
@@ -247,7 +247,7 @@
                 <w:rFonts w:ascii="Times New Roman" w:hAnsi="Times New Roman"/>
                 <w:sz w:val="24"/>
               </w:rPr>
-              <w:t>Công nghệ Thông tin – Khóa K47</w:t>
+              <w:t>Công nghệ Thông tin – Khóa K47 (CTK47-PM)</w:t>
             </w:r>
           </w:p>
         </w:tc>
@@ -271,7 +271,7 @@
                 <w:b/>
                 <w:sz w:val="24"/>
               </w:rPr>
-              <w:t>Giảng viên phụ trách môn:</w:t>
+              <w:t>Giảng viên hướng dẫn:</w:t>
             </w:r>
           </w:p>
         </w:tc>
@@ -292,7 +292,144 @@
                 <w:rFonts w:ascii="Times New Roman" w:hAnsi="Times New Roman"/>
                 <w:sz w:val="24"/>
               </w:rPr>
-              <w:t>Bộ môn Khoa học Máy tính &amp; Kỹ thuật Phần mềm</w:t>
+              <w:t>ThS. Đoàn Minh Khuê</w:t>
+            </w:r>
+          </w:p>
+        </w:tc>
+      </w:tr>
+      <w:tr>
+        <w:tc>
+          <w:tcPr>
+            <w:tcW w:type="dxa" w:w="4535"/>
+            <w:tcW w:w="3118" w:type="dxa"/>
+            <w:tcMar>
+              <w:top w:w="80" w:type="dxa"/>
+              <w:bottom w:w="80" w:type="dxa"/>
+              <w:left w:w="100" w:type="dxa"/>
+              <w:right w:w="100" w:type="dxa"/>
+            </w:tcMar>
+          </w:tcPr>
+          <w:p>
+            <w:r>
+              <w:rPr>
+                <w:rFonts w:ascii="Times New Roman" w:hAnsi="Times New Roman"/>
+                <w:b/>
+                <w:sz w:val="24"/>
+              </w:rPr>
+              <w:t>Kho mã nguồn Frontend:</w:t>
+            </w:r>
+          </w:p>
+        </w:tc>
+        <w:tc>
+          <w:tcPr>
+            <w:tcW w:type="dxa" w:w="4535"/>
+            <w:tcW w:w="5953" w:type="dxa"/>
+            <w:tcMar>
+              <w:top w:w="80" w:type="dxa"/>
+              <w:bottom w:w="80" w:type="dxa"/>
+              <w:left w:w="100" w:type="dxa"/>
+              <w:right w:w="100" w:type="dxa"/>
+            </w:tcMar>
+          </w:tcPr>
+          <w:p>
+            <w:r>
+              <w:rPr>
+                <w:rFonts w:ascii="Times New Roman" w:hAnsi="Times New Roman"/>
+                <w:b/>
+                <w:color w:val="1F4E79"/>
+                <w:sz w:val="24"/>
+              </w:rPr>
+              <w:t>https://github.com/2312741-sudo/javanc</w:t>
+            </w:r>
+          </w:p>
+        </w:tc>
+      </w:tr>
+      <w:tr>
+        <w:tc>
+          <w:tcPr>
+            <w:tcW w:type="dxa" w:w="4535"/>
+            <w:tcW w:w="3118" w:type="dxa"/>
+            <w:tcMar>
+              <w:top w:w="80" w:type="dxa"/>
+              <w:bottom w:w="80" w:type="dxa"/>
+              <w:left w:w="100" w:type="dxa"/>
+              <w:right w:w="100" w:type="dxa"/>
+            </w:tcMar>
+          </w:tcPr>
+          <w:p>
+            <w:r>
+              <w:rPr>
+                <w:rFonts w:ascii="Times New Roman" w:hAnsi="Times New Roman"/>
+                <w:b/>
+                <w:sz w:val="24"/>
+              </w:rPr>
+              <w:t>Kho mã nguồn Backend:</w:t>
+            </w:r>
+          </w:p>
+        </w:tc>
+        <w:tc>
+          <w:tcPr>
+            <w:tcW w:type="dxa" w:w="4535"/>
+            <w:tcW w:w="5953" w:type="dxa"/>
+            <w:tcMar>
+              <w:top w:w="80" w:type="dxa"/>
+              <w:bottom w:w="80" w:type="dxa"/>
+              <w:left w:w="100" w:type="dxa"/>
+              <w:right w:w="100" w:type="dxa"/>
+            </w:tcMar>
+          </w:tcPr>
+          <w:p>
+            <w:r>
+              <w:rPr>
+                <w:rFonts w:ascii="Times New Roman" w:hAnsi="Times New Roman"/>
+                <w:sz w:val="24"/>
+              </w:rPr>
+              <w:t>https://github.com/Tson-dev/JVNC</w:t>
+            </w:r>
+          </w:p>
+        </w:tc>
+      </w:tr>
+      <w:tr>
+        <w:tc>
+          <w:tcPr>
+            <w:tcW w:type="dxa" w:w="4535"/>
+            <w:tcW w:w="3118" w:type="dxa"/>
+            <w:tcMar>
+              <w:top w:w="80" w:type="dxa"/>
+              <w:bottom w:w="80" w:type="dxa"/>
+              <w:left w:w="100" w:type="dxa"/>
+              <w:right w:w="100" w:type="dxa"/>
+            </w:tcMar>
+          </w:tcPr>
+          <w:p>
+            <w:r>
+              <w:rPr>
+                <w:rFonts w:ascii="Times New Roman" w:hAnsi="Times New Roman"/>
+                <w:b/>
+                <w:sz w:val="24"/>
+              </w:rPr>
+              <w:t>Hợp đồng FE ↔ BE:</w:t>
+            </w:r>
+          </w:p>
+        </w:tc>
+        <w:tc>
+          <w:tcPr>
+            <w:tcW w:type="dxa" w:w="4535"/>
+            <w:tcW w:w="5953" w:type="dxa"/>
+            <w:tcMar>
+              <w:top w:w="80" w:type="dxa"/>
+              <w:bottom w:w="80" w:type="dxa"/>
+              <w:left w:w="100" w:type="dxa"/>
+              <w:right w:w="100" w:type="dxa"/>
+            </w:tcMar>
+          </w:tcPr>
+          <w:p>
+            <w:r>
+              <w:rPr>
+                <w:rFonts w:ascii="Times New Roman" w:hAnsi="Times New Roman"/>
+                <w:sz w:val="24"/>
+              </w:rPr>
+              <w:t>https://github.com/Tson-dev/JVNC/blob/main/CONTRACT.md</w:t>
             </w:r>
           </w:p>
         </w:tc>
@@ -1526,7 +1663,7 @@
                 <w:rFonts w:ascii="Times New Roman" w:hAnsi="Times New Roman"/>
                 <w:sz w:val="21"/>
               </w:rPr>
-              <w:t xml:space="preserve">  5.1. Bộ Kiểm Thử Tự Động 60 Test Cases (JUnit 5)</w:t>
+              <w:t xml:space="preserve">  5.1. Bộ Kiểm Thử Tự Động 63 Test Cases (JUnit 5)</w:t>
             </w:r>
           </w:p>
         </w:tc>
@@ -4751,7 +4888,7 @@
           <w:color w:val="2E75B6"/>
           <w:sz w:val="27"/>
         </w:rPr>
-        <w:t>5.1. Bộ Kiểm Thử Tự Động 60 Test Cases (JUnit 5)</w:t>
+        <w:t>5.1. Bộ Kiểm Thử Tự Động 63 Test Cases (JUnit 5)</w:t>
       </w:r>
     </w:p>
     <w:p>
@@ -4765,7 +4902,7 @@
           <w:i w:val="0"/>
           <w:sz w:val="24"/>
         </w:rPr>
-        <w:t>Hệ thống áp dụng phương pháp kiểm thử hướng kiểm chứng (Test-Driven Verification) với tổng cộng 60 test cases tự động được thực thi thông qua Maven Surefire Plugin. Tất cả các bài kiểm thử đều đạt kết quả tuyệt đối (100% BUILD SUCCESS):</w:t>
+        <w:t>Hệ thống áp dụng phương pháp kiểm thử hướng kiểm chứng (Test-Driven Verification) với tổng cộng 63 test cases tự động được thực thi thông qua Maven Surefire Plugin. Tất cả các bài kiểm thử đều đạt kết quả tuyệt đối (100% BUILD SUCCESS):</w:t>
       </w:r>
     </w:p>
     <w:p>
@@ -7584,7 +7721,7 @@
           <w:rFonts w:ascii="Times New Roman" w:hAnsi="Times New Roman"/>
           <w:sz w:val="24"/>
         </w:rPr>
-        <w:t>Đạt 60/60 kiểm thử tự động (100% BUILD SUCCESS), tích hợp thành công kiến trúc mạng phân tán TCP Client/Server và thuật toán khử trùng lặp dữ liệu lớn với sai số Δ &lt; 0.0001.</w:t>
+        <w:t>Đạt 63/63 kiểm thử tự động (100% BUILD SUCCESS), tích hợp thành công kiến trúc mạng phân tán TCP Client/Server và thuật toán khử trùng lặp dữ liệu lớn với sai số Δ &lt; 0.0001.</w:t>
       </w:r>
     </w:p>
     <w:p>

</xml_diff>